<commit_message>
feat: add Tipos de Cota catalog and expand Situação guard rules for Controle de Certame
- New "Tipos de Cota" menu (list + form), same pattern as Locais/Fase do Certame,
  with an associated Lei field; Cotas block in CertameFormContent now sources
  tipo de cota from this catalog instead of a hardcoded list.
- Situação: new/extended guard rules (RN004 covers Homologação Parcial, RN005
  tightened, new RN017-RN023 for Retificação Parcial/Prorrogação/Paralisação/
  Retomada do Cronograma), plus RN001 guard so "Editar" only shows for
  certames em Abertura/Retificação de Edital.
- DocumentosLegaisAssociadosSeplag: new optional `compact` prop to match plain
  input height in short forms.
- Updated the corresponding US docx files (Situação/Histórico e Listagem de
  Certames) with the new/revised regras de negócio and critérios de aceitação.

Co-Authored-By: Claude Sonnet 5 <noreply@anthropic.com>
</commit_message>
<xml_diff>
--- a/documentação controle de certame/USXXX - Controle de Certame - Listagem de Certames.docx
+++ b/documentação controle de certame/USXXX - Controle de Certame - Listagem de Certames.docx
@@ -319,6 +319,96 @@
           </w:p>
         </w:tc>
       </w:tr>
+      <w:tr>
+        <w:tc>
+          <w:tcPr>
+            <w:tcW w:type="pct" w:w="12%"/>
+            <w:tcMar>
+              <w:top w:type="dxa" w:w="60"/>
+              <w:left w:type="dxa" w:w="80"/>
+              <w:bottom w:type="dxa" w:w="60"/>
+              <w:right w:type="dxa" w:w="80"/>
+            </w:tcMar>
+          </w:tcPr>
+          <w:p>
+            <w:r>
+              <w:rPr>
+                <w:b w:val="false"/>
+                <w:bCs w:val="false"/>
+                <w:sz w:val="20"/>
+                <w:szCs w:val="20"/>
+              </w:rPr>
+              <w:t>01/09/2026</w:t>
+            </w:r>
+          </w:p>
+        </w:tc>
+        <w:tc>
+          <w:tcPr>
+            <w:tcW w:type="pct" w:w="10%"/>
+            <w:tcMar>
+              <w:top w:type="dxa" w:w="60"/>
+              <w:left w:type="dxa" w:w="80"/>
+              <w:bottom w:type="dxa" w:w="60"/>
+              <w:right w:type="dxa" w:w="80"/>
+            </w:tcMar>
+          </w:tcPr>
+          <w:p>
+            <w:r>
+              <w:rPr>
+                <w:b w:val="false"/>
+                <w:bCs w:val="false"/>
+                <w:sz w:val="20"/>
+                <w:szCs w:val="20"/>
+              </w:rPr>
+              <w:t>1.1</w:t>
+            </w:r>
+          </w:p>
+        </w:tc>
+        <w:tc>
+          <w:tcPr>
+            <w:tcW w:type="pct" w:w="58%"/>
+            <w:tcMar>
+              <w:top w:type="dxa" w:w="60"/>
+              <w:left w:type="dxa" w:w="80"/>
+              <w:bottom w:type="dxa" w:w="60"/>
+              <w:right w:type="dxa" w:w="80"/>
+            </w:tcMar>
+          </w:tcPr>
+          <w:p>
+            <w:r>
+              <w:rPr>
+                <w:b w:val="false"/>
+                <w:bCs w:val="false"/>
+                <w:sz w:val="20"/>
+                <w:szCs w:val="20"/>
+              </w:rPr>
+              <w:t>RN001 corrigida: “Editar” só aparece com o certame em Abertura ou Retificação de Edital (antes dizia “sem exigir abertura prévia”, o que sugeria Editar sempre visível). CA03 ajustada no mesmo sentido; RN005–RN012 incorporadas (documento estava parado em RN004); RN013 removida por ser duplicata literal de RN012.</w:t>
+            </w:r>
+          </w:p>
+        </w:tc>
+        <w:tc>
+          <w:tcPr>
+            <w:tcW w:type="pct" w:w="20%"/>
+            <w:tcMar>
+              <w:top w:type="dxa" w:w="60"/>
+              <w:left w:type="dxa" w:w="80"/>
+              <w:bottom w:type="dxa" w:w="60"/>
+              <w:right w:type="dxa" w:w="80"/>
+            </w:tcMar>
+          </w:tcPr>
+          <w:p>
+            <w:r>
+              <w:rPr>
+                <w:b w:val="false"/>
+                <w:bCs w:val="false"/>
+                <w:sz w:val="20"/>
+                <w:szCs w:val="20"/>
+              </w:rPr>
+              <w:t>Carlos Mattos</w:t>
+            </w:r>
+          </w:p>
+        </w:tc>
+      </w:tr>
     </w:tbl>
     <w:p>
       <w:pPr>
@@ -593,7 +683,7 @@
           <w:sz w:val="22"/>
           <w:szCs w:val="22"/>
         </w:rPr>
-        <w:t xml:space="preserve">Dado que a listagem está carregada, quando o usuário observa uma linha, então estão disponíveis as ações Visualizar, Editar e Situação/Histórico, vinculadas à situação atual do registro.</w:t>
+        <w:t>Dado que a listagem está carregada, quando o usuário observa uma linha, então estão disponíveis Visualizar e Situação/Histórico sempre, e Editar somente quando a situação atual do certame é Abertura ou Retificação de Edital (RN001).</w:t>
       </w:r>
     </w:p>
     <w:p>
@@ -3908,7 +3998,7 @@
                 <w:sz w:val="20"/>
                 <w:szCs w:val="20"/>
               </w:rPr>
-              <w:t xml:space="preserve">Cada linha da listagem de certames disponibiliza os atalhos Visualizar, Editar e Situação/Histórico, vinculados à situação atual do registro, sem exigir abertura prévia.</w:t>
+              <w:t>Cada linha de certame salvo na listagem disponibiliza os atalhos Visualizar e Situação/Histórico sempre; o atalho Editar só é exibido quando a situação atual do certame é Abertura ou Retificação de Edital — nas demais situações (Paralisação, Homologação, Homologação Parcial, Prorrogação, Cancelamento/Anulação etc.) o cadastro não é mais editável por aqui, só via Nova Situação.</w:t>
             </w:r>
           </w:p>
         </w:tc>
@@ -4047,6 +4137,374 @@
                 <w:szCs w:val="20"/>
               </w:rPr>
               <w:t xml:space="preserve">O progresso de um cadastro novo ainda não salvo é mantido localmente como rascunho e oferecido para retomada ou descarte ao reabrir a listagem.</w:t>
+            </w:r>
+          </w:p>
+        </w:tc>
+      </w:tr>
+      <w:tr>
+        <w:tc>
+          <w:tcPr>
+            <w:tcW w:type="pct" w:w="12%"/>
+            <w:tcMar>
+              <w:top w:type="dxa" w:w="60"/>
+              <w:left w:type="dxa" w:w="80"/>
+              <w:bottom w:type="dxa" w:w="60"/>
+              <w:right w:type="dxa" w:w="80"/>
+            </w:tcMar>
+          </w:tcPr>
+          <w:p>
+            <w:r>
+              <w:rPr>
+                <w:b w:val="false"/>
+                <w:bCs w:val="false"/>
+                <w:sz w:val="20"/>
+                <w:szCs w:val="20"/>
+              </w:rPr>
+              <w:t>RN005</w:t>
+            </w:r>
+          </w:p>
+        </w:tc>
+        <w:tc>
+          <w:tcPr>
+            <w:tcW w:type="pct" w:w="88%"/>
+            <w:tcMar>
+              <w:top w:type="dxa" w:w="60"/>
+              <w:left w:type="dxa" w:w="80"/>
+              <w:bottom w:type="dxa" w:w="60"/>
+              <w:right w:type="dxa" w:w="80"/>
+            </w:tcMar>
+          </w:tcPr>
+          <w:p>
+            <w:r>
+              <w:rPr>
+                <w:b w:val="false"/>
+                <w:bCs w:val="false"/>
+                <w:sz w:val="20"/>
+                <w:szCs w:val="20"/>
+              </w:rPr>
+              <w:t>A seleção de um dos dois cartões de Tipo (Concurso Público ou Processo Seletivo Simplificado) confirma imediatamente o tipo do certame e avança para a etapa “Identificação”; não existe botão de confirmação separado nem estado de seleção pendente nessa etapa.</w:t>
+            </w:r>
+          </w:p>
+        </w:tc>
+      </w:tr>
+      <w:tr>
+        <w:tc>
+          <w:tcPr>
+            <w:tcW w:type="pct" w:w="12%"/>
+            <w:tcMar>
+              <w:top w:type="dxa" w:w="60"/>
+              <w:left w:type="dxa" w:w="80"/>
+              <w:bottom w:type="dxa" w:w="60"/>
+              <w:right w:type="dxa" w:w="80"/>
+            </w:tcMar>
+          </w:tcPr>
+          <w:p>
+            <w:r>
+              <w:rPr>
+                <w:b w:val="false"/>
+                <w:bCs w:val="false"/>
+                <w:sz w:val="20"/>
+                <w:szCs w:val="20"/>
+              </w:rPr>
+              <w:t>RN006</w:t>
+            </w:r>
+          </w:p>
+        </w:tc>
+        <w:tc>
+          <w:tcPr>
+            <w:tcW w:type="pct" w:w="88%"/>
+            <w:tcMar>
+              <w:top w:type="dxa" w:w="60"/>
+              <w:left w:type="dxa" w:w="80"/>
+              <w:bottom w:type="dxa" w:w="60"/>
+              <w:right w:type="dxa" w:w="80"/>
+            </w:tcMar>
+          </w:tcPr>
+          <w:p>
+            <w:r>
+              <w:rPr>
+                <w:b w:val="false"/>
+                <w:bCs w:val="false"/>
+                <w:sz w:val="20"/>
+                <w:szCs w:val="20"/>
+              </w:rPr>
+              <w:t>Os quatro cards de resumo (Total de certames, Em abertura, Homologados, Cancelados/Paralisados) recalculam suas contagens em tempo real a partir da situação atual de cada certame cadastrado, refletindo imediatamente qualquer novo cadastro, edição de situação ou exclusão, sem exigir atualização manual da página.</w:t>
+            </w:r>
+          </w:p>
+        </w:tc>
+      </w:tr>
+      <w:tr>
+        <w:tc>
+          <w:tcPr>
+            <w:tcW w:type="pct" w:w="12%"/>
+            <w:tcMar>
+              <w:top w:type="dxa" w:w="60"/>
+              <w:left w:type="dxa" w:w="80"/>
+              <w:bottom w:type="dxa" w:w="60"/>
+              <w:right w:type="dxa" w:w="80"/>
+            </w:tcMar>
+          </w:tcPr>
+          <w:p>
+            <w:r>
+              <w:rPr>
+                <w:b w:val="false"/>
+                <w:bCs w:val="false"/>
+                <w:sz w:val="20"/>
+                <w:szCs w:val="20"/>
+              </w:rPr>
+              <w:t>RN007</w:t>
+            </w:r>
+          </w:p>
+        </w:tc>
+        <w:tc>
+          <w:tcPr>
+            <w:tcW w:type="pct" w:w="88%"/>
+            <w:tcMar>
+              <w:top w:type="dxa" w:w="60"/>
+              <w:left w:type="dxa" w:w="80"/>
+              <w:bottom w:type="dxa" w:w="60"/>
+              <w:right w:type="dxa" w:w="80"/>
+            </w:tcMar>
+          </w:tcPr>
+          <w:p>
+            <w:r>
+              <w:rPr>
+                <w:b w:val="false"/>
+                <w:bCs w:val="false"/>
+                <w:sz w:val="20"/>
+                <w:szCs w:val="20"/>
+              </w:rPr>
+              <w:t>Uma vez confirmado o tipo do certame, ele não pode mais ser alterado dentro do mesmo cadastro/rascunho; para escolher outro tipo, é necessário descartar o rascunho atual e iniciar um novo cadastro.</w:t>
+            </w:r>
+          </w:p>
+        </w:tc>
+      </w:tr>
+      <w:tr>
+        <w:tc>
+          <w:tcPr>
+            <w:tcW w:type="pct" w:w="12%"/>
+            <w:tcMar>
+              <w:top w:type="dxa" w:w="60"/>
+              <w:left w:type="dxa" w:w="80"/>
+              <w:bottom w:type="dxa" w:w="60"/>
+              <w:right w:type="dxa" w:w="80"/>
+            </w:tcMar>
+          </w:tcPr>
+          <w:p>
+            <w:r>
+              <w:rPr>
+                <w:b w:val="false"/>
+                <w:bCs w:val="false"/>
+                <w:sz w:val="20"/>
+                <w:szCs w:val="20"/>
+              </w:rPr>
+              <w:t>RN008</w:t>
+            </w:r>
+          </w:p>
+        </w:tc>
+        <w:tc>
+          <w:tcPr>
+            <w:tcW w:type="pct" w:w="88%"/>
+            <w:tcMar>
+              <w:top w:type="dxa" w:w="60"/>
+              <w:left w:type="dxa" w:w="80"/>
+              <w:bottom w:type="dxa" w:w="60"/>
+              <w:right w:type="dxa" w:w="80"/>
+            </w:tcMar>
+          </w:tcPr>
+          <w:p>
+            <w:r>
+              <w:rPr>
+                <w:b w:val="false"/>
+                <w:bCs w:val="false"/>
+                <w:sz w:val="20"/>
+                <w:szCs w:val="20"/>
+              </w:rPr>
+              <w:t>Se o rascunho em andamento já possui o tipo do certame confirmado, a etapa de seleção de tipo é pulada ao retomar o cadastro, abrindo diretamente na aba em que o preenchimento havia parado.</w:t>
+            </w:r>
+          </w:p>
+        </w:tc>
+      </w:tr>
+      <w:tr>
+        <w:tc>
+          <w:tcPr>
+            <w:tcW w:type="pct" w:w="12%"/>
+            <w:tcMar>
+              <w:top w:type="dxa" w:w="60"/>
+              <w:left w:type="dxa" w:w="80"/>
+              <w:bottom w:type="dxa" w:w="60"/>
+              <w:right w:type="dxa" w:w="80"/>
+            </w:tcMar>
+          </w:tcPr>
+          <w:p>
+            <w:r>
+              <w:rPr>
+                <w:b w:val="false"/>
+                <w:bCs w:val="false"/>
+                <w:sz w:val="20"/>
+                <w:szCs w:val="20"/>
+              </w:rPr>
+              <w:t>RN009</w:t>
+            </w:r>
+          </w:p>
+        </w:tc>
+        <w:tc>
+          <w:tcPr>
+            <w:tcW w:type="pct" w:w="88%"/>
+            <w:tcMar>
+              <w:top w:type="dxa" w:w="60"/>
+              <w:left w:type="dxa" w:w="80"/>
+              <w:bottom w:type="dxa" w:w="60"/>
+              <w:right w:type="dxa" w:w="80"/>
+            </w:tcMar>
+          </w:tcPr>
+          <w:p>
+            <w:r>
+              <w:rPr>
+                <w:b w:val="false"/>
+                <w:bCs w:val="false"/>
+                <w:sz w:val="20"/>
+                <w:szCs w:val="20"/>
+              </w:rPr>
+              <w:t>O campo “Pesquisar” é um dropdown com busca embutida: as opções são geradas a partir de todos os certames cadastrados (rótulo = número + nome do edital), e a lista pode ser filtrada digitando qualquer trecho do rótulo. Selecionar uma opção restringe a grid a esse único certame; a opção “Todos” (padrão) remove o filtro.</w:t>
+            </w:r>
+          </w:p>
+        </w:tc>
+      </w:tr>
+      <w:tr>
+        <w:tc>
+          <w:tcPr>
+            <w:tcW w:type="pct" w:w="12%"/>
+            <w:tcMar>
+              <w:top w:type="dxa" w:w="60"/>
+              <w:left w:type="dxa" w:w="80"/>
+              <w:bottom w:type="dxa" w:w="60"/>
+              <w:right w:type="dxa" w:w="80"/>
+            </w:tcMar>
+          </w:tcPr>
+          <w:p>
+            <w:r>
+              <w:rPr>
+                <w:b w:val="false"/>
+                <w:bCs w:val="false"/>
+                <w:sz w:val="20"/>
+                <w:szCs w:val="20"/>
+              </w:rPr>
+              <w:t>RN010</w:t>
+            </w:r>
+          </w:p>
+        </w:tc>
+        <w:tc>
+          <w:tcPr>
+            <w:tcW w:type="pct" w:w="88%"/>
+            <w:tcMar>
+              <w:top w:type="dxa" w:w="60"/>
+              <w:left w:type="dxa" w:w="80"/>
+              <w:bottom w:type="dxa" w:w="60"/>
+              <w:right w:type="dxa" w:w="80"/>
+            </w:tcMar>
+          </w:tcPr>
+          <w:p>
+            <w:r>
+              <w:rPr>
+                <w:b w:val="false"/>
+                <w:bCs w:val="false"/>
+                <w:sz w:val="20"/>
+                <w:szCs w:val="20"/>
+              </w:rPr>
+              <w:t>Sempre que o usuário altera um dos filtros de seleção — Órgão, Exercício, Tipo ou Situação — ou muda a quantidade de itens exibidos por página, o sistema volta automaticamente para a página 1 da listagem, mesmo que ele estivesse em outra página no momento da alteração. Isso evita que o usuário fique “perdido” numa página que pode não existir mais depois do filtro aplicado. Essa regra não vale para o campo “Pesquisar”: selecionar um certame no dropdown, ou digitar um termo de busca livre, não move o usuário de volta para a primeira página automaticamente — ele permanece na página em que estava.</w:t>
+            </w:r>
+          </w:p>
+        </w:tc>
+      </w:tr>
+      <w:tr>
+        <w:tc>
+          <w:tcPr>
+            <w:tcW w:type="pct" w:w="12%"/>
+            <w:tcMar>
+              <w:top w:type="dxa" w:w="60"/>
+              <w:left w:type="dxa" w:w="80"/>
+              <w:bottom w:type="dxa" w:w="60"/>
+              <w:right w:type="dxa" w:w="80"/>
+            </w:tcMar>
+          </w:tcPr>
+          <w:p>
+            <w:r>
+              <w:rPr>
+                <w:b w:val="false"/>
+                <w:bCs w:val="false"/>
+                <w:sz w:val="20"/>
+                <w:szCs w:val="20"/>
+              </w:rPr>
+              <w:t>RN011</w:t>
+            </w:r>
+          </w:p>
+        </w:tc>
+        <w:tc>
+          <w:tcPr>
+            <w:tcW w:type="pct" w:w="88%"/>
+            <w:tcMar>
+              <w:top w:type="dxa" w:w="60"/>
+              <w:left w:type="dxa" w:w="80"/>
+              <w:bottom w:type="dxa" w:w="60"/>
+              <w:right w:type="dxa" w:w="80"/>
+            </w:tcMar>
+          </w:tcPr>
+          <w:p>
+            <w:r>
+              <w:rPr>
+                <w:b w:val="false"/>
+                <w:bCs w:val="false"/>
+                <w:sz w:val="20"/>
+                <w:szCs w:val="20"/>
+              </w:rPr>
+              <w:t>A listagem é exibida ordenada por data de publicação do edital, do mais recente para o mais antigo, de forma consistente entre carregamentos e após qualquer filtro aplicado.</w:t>
+            </w:r>
+          </w:p>
+        </w:tc>
+      </w:tr>
+      <w:tr>
+        <w:tc>
+          <w:tcPr>
+            <w:tcW w:type="pct" w:w="12%"/>
+            <w:tcMar>
+              <w:top w:type="dxa" w:w="60"/>
+              <w:left w:type="dxa" w:w="80"/>
+              <w:bottom w:type="dxa" w:w="60"/>
+              <w:right w:type="dxa" w:w="80"/>
+            </w:tcMar>
+          </w:tcPr>
+          <w:p>
+            <w:r>
+              <w:rPr>
+                <w:b w:val="false"/>
+                <w:bCs w:val="false"/>
+                <w:sz w:val="20"/>
+                <w:szCs w:val="20"/>
+              </w:rPr>
+              <w:t>RN012</w:t>
+            </w:r>
+          </w:p>
+        </w:tc>
+        <w:tc>
+          <w:tcPr>
+            <w:tcW w:type="pct" w:w="88%"/>
+            <w:tcMar>
+              <w:top w:type="dxa" w:w="60"/>
+              <w:left w:type="dxa" w:w="80"/>
+              <w:bottom w:type="dxa" w:w="60"/>
+              <w:right w:type="dxa" w:w="80"/>
+            </w:tcMar>
+          </w:tcPr>
+          <w:p>
+            <w:r>
+              <w:rPr>
+                <w:b w:val="false"/>
+                <w:bCs w:val="false"/>
+                <w:sz w:val="20"/>
+                <w:szCs w:val="20"/>
+              </w:rPr>
+              <w:t>A ação “Visualizar” abre o certame em modo somente leitura: campos desabilitados, ações de escrita ocultas, mantendo só a navegação entre abas e “Voltar”.</w:t>
             </w:r>
           </w:p>
         </w:tc>

</xml_diff>